<commit_message>
feat(contratos): align Eventos-Externo template with Eventos-Residentes structure
- termo_eventos.docx: demarcate ESCOPO fields (perfil_evento, data_evento_exibicao,
  horario_evento, num_participantes, formato_evento, ambientes_adicionais, obs_evento)
  and signature (nome_responsavel, cpf_responsavel) — 9 → 16 markers
- Keep Externo's own text (à vista payment + cancellation, no 'RESIDENTES' in title)
- CAMPOS_TERMO_EVENTOS form fields mirror residentes (minus parcelas)
- hasDataEvento + CAMPOS_EXTENSO now include termo_eventos for date handling

Co-Authored-By: Claude Sonnet 4.6 <noreply@anthropic.com>
Claude-Session: https://claude.ai/code/session_01Nyq6aDrZrJDHGsDi2LiU42
</commit_message>
<xml_diff>
--- a/_template-source/termo_eventos.docx
+++ b/_template-source/termo_eventos.docx
@@ -241,9 +241,9 @@
           <w:szCs w:val="18"/>
           <w:rtl w:val="0"/>
         </w:rPr>
-        <w:t xml:space="preserve">Perfil do evento:</w:t>
+        <w:t xml:space="preserve">Perfil do evento: {{perfil_evento}}</w:t>
         <w:br w:type="textWrapping"/>
-        <w:t xml:space="preserve">Data: </w:t>
+        <w:t xml:space="preserve">Data: {{data_evento_exibicao}}</w:t>
       </w:r>
     </w:p>
     <w:p>
@@ -269,7 +269,7 @@
           <w:szCs w:val="18"/>
           <w:rtl w:val="0"/>
         </w:rPr>
-        <w:t xml:space="preserve">Horário: </w:t>
+        <w:t xml:space="preserve">Horário: {{horario_evento}}</w:t>
       </w:r>
     </w:p>
     <w:p>
@@ -295,7 +295,7 @@
           <w:szCs w:val="18"/>
           <w:rtl w:val="0"/>
         </w:rPr>
-        <w:t xml:space="preserve">Número de pessoas/participantes: </w:t>
+        <w:t xml:space="preserve">Número de pessoas/participantes: {{num_participantes}}</w:t>
       </w:r>
     </w:p>
     <w:p>
@@ -321,7 +321,7 @@
           <w:szCs w:val="18"/>
           <w:rtl w:val="0"/>
         </w:rPr>
-        <w:t xml:space="preserve">Formato: </w:t>
+        <w:t xml:space="preserve">Formato: {{formato_evento}}</w:t>
       </w:r>
     </w:p>
     <w:p>
@@ -347,7 +347,9 @@
           <w:szCs w:val="18"/>
           <w:rtl w:val="0"/>
         </w:rPr>
-        <w:t xml:space="preserve">Ambientes adicionais utilizados: </w:t>
+        <w:t xml:space="preserve">Ambientes adicionais utilizados: {{ambientes_adicionais}}</w:t>
+        <w:br w:type="textWrapping"/>
+        <w:t xml:space="preserve">Obs: {{obs_evento}}</w:t>
       </w:r>
     </w:p>
     <w:p>
@@ -817,7 +819,7 @@
           <w:szCs w:val="19"/>
           <w:rtl w:val="0"/>
         </w:rPr>
-        <w:t xml:space="preserve">NOME: </w:t>
+        <w:t xml:space="preserve">NOME: {{nome_responsavel}}</w:t>
       </w:r>
     </w:p>
     <w:p>
@@ -861,7 +863,7 @@
           <w:szCs w:val="19"/>
           <w:rtl w:val="0"/>
         </w:rPr>
-        <w:t xml:space="preserve">CPF: </w:t>
+        <w:t xml:space="preserve">CPF: {{cpf_responsavel}}</w:t>
       </w:r>
     </w:p>
     <w:p>

</xml_diff>